<commit_message>
v2.33 (John's word, 13 October): Session 11 Any Doubts? checked against the Four Connects deck
New slide and Reading Card: the silent place (remember where God seemed
silent, bring in the time you heard, invite Jesus in with permission, about
three minutes of silence, write - is something blocking? the downside of a
deeper connection? - share optional). The check-in receives the Garden's
preparation sentence; the teaching names two kinds of doubt (the four steps /
the How Did You Know? checks); week two adds "something I heard and did not
obey?" and "what is at risk for me to hear?". Clock re-timed (pairs 26 min,
silent place 13). School calendar stripped (midpoint, quarter break,
Christmas, January). Master renumber: S11 = 159-175, 323 pages; leader notes
rebuilt S11-S22; numbering map updated. Take-home and run sheet filled in.

Co-Authored-By: Claude Opus 5.5 <noreply@anthropic.com>
</commit_message>
<xml_diff>
--- a/_implementation-notes/evening-series/FotH Evening Session 11 Leader Notes DRAFT v1.docx
+++ b/_implementation-notes/evening-series/FotH Evening Session 11 Leader Notes DRAFT v1.docx
@@ -45,7 +45,7 @@
           <w:color w:val="595959"/>
           <w:sz w:val="18"/>
         </w:rPr>
-        <w:t>Match the big number on each block to the number in the bottom-right corner of the screen. This session is 159–174 in the series' one continuous numbering. The first slide, the series title, is “Title” here.</w:t>
+        <w:t>Match the big number on each block to the number in the bottom-right corner of the screen. This session is 159–175 in the series' one continuous numbering. The first slide, the series title, is “Title” here.</w:t>
       </w:r>
     </w:p>
     <w:p>
@@ -147,7 +147,7 @@
           <w:color w:val="7F7F7F"/>
           <w:sz w:val="16"/>
         </w:rPr>
-        <w:t xml:space="preserve">   · slide 1 of 17</w:t>
+        <w:t xml:space="preserve">   · slide 1 of 18</w:t>
       </w:r>
     </w:p>
     <w:p>
@@ -219,7 +219,7 @@
           <w:color w:val="7F7F7F"/>
           <w:sz w:val="16"/>
         </w:rPr>
-        <w:t xml:space="preserve">   · slide 2 of 17</w:t>
+        <w:t xml:space="preserve">   · slide 2 of 18</w:t>
       </w:r>
     </w:p>
     <w:p>
@@ -291,7 +291,7 @@
           <w:color w:val="7F7F7F"/>
           <w:sz w:val="16"/>
         </w:rPr>
-        <w:t xml:space="preserve">   · slide 3 of 17</w:t>
+        <w:t xml:space="preserve">   · slide 3 of 18</w:t>
       </w:r>
     </w:p>
     <w:p>
@@ -350,7 +350,7 @@
         <w:spacing w:before="0" w:after="60"/>
       </w:pPr>
       <w:r>
-        <w:t>1. Locate tonight on the map, plainly: Session 11 stands in the third box — Connect with God — at the year's midpoint. Each connection makes the next one real (Matt. 22:37–40).</w:t>
+        <w:t>1. Locate tonight on the map, plainly: Session 11 stands in the third box — Connect with God. Each connection makes the next one real (Matt. 22:37–40).</w:t>
       </w:r>
     </w:p>
     <w:p>
@@ -434,7 +434,7 @@
           <w:color w:val="7F7F7F"/>
           <w:sz w:val="16"/>
         </w:rPr>
-        <w:t xml:space="preserve">   · slide 4 of 17</w:t>
+        <w:t xml:space="preserve">   · slide 4 of 18</w:t>
       </w:r>
     </w:p>
     <w:p>
@@ -484,7 +484,7 @@
         <w:t xml:space="preserve">BEATS: </w:t>
       </w:r>
       <w:r>
-        <w:t>1. Week 11 — last gathering of the quarter and the exact midpoint of the year: eleven evenings behind, eleven ahead. 2. Today: Any Doubts? — bringing the small quiet doubts we never say aloud, honestly, to God, in front of one other person. 3. With the Garden, one of the two highest-confidence practices in this whole body of work — treat it with care. 4. Frame it early and repeat it: doubt is not disbelief; this is the gap between what we say and what we actually trust.</w:t>
+        <w:t>1. Session 11 — the last evening of Connect with God. Tonight picks up the Garden evening's thread: what I'm not sure was God. 2. Today: Any Doubts? — bringing the small quiet doubts we never say aloud, honestly, to God, in front of one other person. 3. With the Garden, one of the two highest-confidence practices in this whole body of work — treat it with care. 4. Frame it early and repeat it: doubt is not disbelief; this is the gap between what we say and what we actually trust. 5. The shape (John's word, 13 October): the four steps in pairs, then the silent place from the Four Connects deck — remember where God seemed silent, bring in the time you heard, invite Jesus in.</w:t>
       </w:r>
     </w:p>
     <w:p>
@@ -528,7 +528,7 @@
           <w:color w:val="7F7F7F"/>
           <w:sz w:val="16"/>
         </w:rPr>
-        <w:t xml:space="preserve">   · slide 5 of 17</w:t>
+        <w:t xml:space="preserve">   · slide 5 of 18</w:t>
       </w:r>
     </w:p>
     <w:p>
@@ -545,7 +545,7 @@
           <w:color w:val="6B8E3F"/>
           <w:sz w:val="18"/>
         </w:rPr>
-        <w:t xml:space="preserve">S11 · 7:00–7:08 · </w:t>
+        <w:t xml:space="preserve">S11 · 7:00–7:06 · </w:t>
       </w:r>
       <w:r>
         <w:rPr>
@@ -624,7 +624,7 @@
           <w:color w:val="2C5F2D"/>
           <w:sz w:val="24"/>
         </w:rPr>
-        <w:t xml:space="preserve">   Week 9 Check-In — the Garden Returns</w:t>
+        <w:t xml:space="preserve">   Check-In — the Garden, and What I’m Not Sure Was God</w:t>
       </w:r>
       <w:r>
         <w:rPr>
@@ -640,7 +640,7 @@
           <w:color w:val="7F7F7F"/>
           <w:sz w:val="16"/>
         </w:rPr>
-        <w:t xml:space="preserve">   · slide 6 of 17</w:t>
+        <w:t xml:space="preserve">   · slide 6 of 18</w:t>
       </w:r>
     </w:p>
     <w:p>
@@ -657,7 +657,7 @@
           <w:color w:val="6B8E3F"/>
           <w:sz w:val="18"/>
         </w:rPr>
-        <w:t xml:space="preserve">S11 · 7:08–7:25 · </w:t>
+        <w:t xml:space="preserve">S11 · 7:06–7:14 · </w:t>
       </w:r>
       <w:r>
         <w:rPr>
@@ -690,7 +690,7 @@
         <w:t xml:space="preserve">BEATS: </w:t>
       </w:r>
       <w:r>
-        <w:t>1. One sentence on the garden returns — how it went, what surfaced, or that you didn't get to it. 2. Take 2–3 voluntary contributions; receive without commentary. 3. Move on with: 'Good. The garden is still there. You can return any time. We continue.'</w:t>
+        <w:t>1. One sentence on the garden returns — how it went, what surfaced, whether anyone tested what they noticed with the How Did You Know? card. 2. The preparation sentence from the Garden take-home: 'One thing I'm not sure was God, or one question I'd bring tonight.' Say it aloud, or keep it for your pair — both are fine. 3. Two or three voluntary contributions; receive without commentary. Move on with: 'Good. The garden is still there. Tonight we bring the questions.'</w:t>
       </w:r>
     </w:p>
     <w:p>
@@ -708,7 +708,7 @@
         <w:t xml:space="preserve">CUES: </w:t>
       </w:r>
       <w:r>
-        <w:t>Arranged parent opens (check the Run Card) — never cold-call a teen; pass-anytime holds.</w:t>
+        <w:t>Arranged parent opens — never cold-call a teen; pass-anytime holds.</w:t>
       </w:r>
     </w:p>
     <w:p>
@@ -752,7 +752,7 @@
           <w:color w:val="7F7F7F"/>
           <w:sz w:val="16"/>
         </w:rPr>
-        <w:t xml:space="preserve">   · slide 7 of 17</w:t>
+        <w:t xml:space="preserve">   · slide 7 of 18</w:t>
       </w:r>
     </w:p>
     <w:p>
@@ -769,7 +769,7 @@
           <w:color w:val="6B8E3F"/>
           <w:sz w:val="18"/>
         </w:rPr>
-        <w:t xml:space="preserve">S11 · 7:25–7:33 · </w:t>
+        <w:t xml:space="preserve">S11 · 7:14–7:20 · </w:t>
       </w:r>
       <w:r>
         <w:rPr>
@@ -846,7 +846,7 @@
           <w:color w:val="7F7F7F"/>
           <w:sz w:val="16"/>
         </w:rPr>
-        <w:t xml:space="preserve">   · slide 8 of 17</w:t>
+        <w:t xml:space="preserve">   · slide 8 of 18</w:t>
       </w:r>
     </w:p>
     <w:p>
@@ -863,7 +863,7 @@
           <w:color w:val="6B8E3F"/>
           <w:sz w:val="18"/>
         </w:rPr>
-        <w:t xml:space="preserve">S11 · 7:33–7:41 · </w:t>
+        <w:t xml:space="preserve">S11 · 7:20–7:28 · </w:t>
       </w:r>
       <w:r>
         <w:rPr>
@@ -896,7 +896,7 @@
         <w:t xml:space="preserve">BEATS: </w:t>
       </w:r>
       <w:r>
-        <w:t>1. Callback, 30s: journals open to the first-night question — naming a doubt takes the same courage. 2. The seat for the skeptic, named ALOUD: a doubt bigger than today's list is welcome and has its own standing door — any Companion, any week, for as long as it takes. 3. Whiteboard walk: NAME (specific, not abstract) / EXAGGERATE (expose the brake, not endorse it) / SIT (feel it, 10–15s) / RE-READ (the Spirit works; you notice). 4. Demo with a Co-Companion, 3 min — real scripture, real small doubt; do NOT resolve it at the end. The pairs calibrate everything against this demo.</w:t>
+        <w:t>1. Callback, 30s: journals open to the first-night question — naming a doubt takes the same courage. 2. The seat for the skeptic, named ALOUD: a doubt bigger than today's list is welcome and has its own standing door — any Companion, any week, for as long as it takes. 3. Name the two kinds of doubt: doubting what God has said — tonight's four steps; and doubting whether I heard him at all — that goes to the How Did You Know? checks from the Garden evening, tested in company, never settled alone. 4. Whiteboard walk: NAME (specific, not abstract) / EXAGGERATE (expose the brake, not endorse it) / SIT (feel it, 10–15s) / RE-READ (the Spirit works; you notice). 5. Demo with a Co-Companion, 3 min — real scripture, real small doubt; do NOT resolve it at the end. The pairs calibrate everything against this demo.</w:t>
       </w:r>
     </w:p>
     <w:p>
@@ -976,7 +976,7 @@
           <w:color w:val="7F7F7F"/>
           <w:sz w:val="16"/>
         </w:rPr>
-        <w:t xml:space="preserve">   · slide 9 of 17</w:t>
+        <w:t xml:space="preserve">   · slide 9 of 18</w:t>
       </w:r>
     </w:p>
     <w:p>
@@ -993,7 +993,7 @@
           <w:color w:val="6B8E3F"/>
           <w:sz w:val="18"/>
         </w:rPr>
-        <w:t xml:space="preserve">S11 · 7:41–7:43 · </w:t>
+        <w:t xml:space="preserve">S11 · 7:28–7:30 · </w:t>
       </w:r>
       <w:r>
         <w:rPr>
@@ -1089,7 +1089,7 @@
           <w:color w:val="7F7F7F"/>
           <w:sz w:val="16"/>
         </w:rPr>
-        <w:t xml:space="preserve">   · slide 10 of 17</w:t>
+        <w:t xml:space="preserve">   · slide 10 of 18</w:t>
       </w:r>
     </w:p>
     <w:p>
@@ -1106,7 +1106,7 @@
           <w:color w:val="6B8E3F"/>
           <w:sz w:val="18"/>
         </w:rPr>
-        <w:t xml:space="preserve">S11 · 7:43–8:14 · </w:t>
+        <w:t xml:space="preserve">S11 · 7:30–7:56 · </w:t>
       </w:r>
       <w:r>
         <w:rPr>
@@ -1140,7 +1140,7 @@
         <w:t xml:space="preserve">BEATS: </w:t>
       </w:r>
       <w:r>
-        <w:t>1. Thirty minutes: one full cycle each direction, about 7 min per turn, parent's turn first; partial second cycle if time allows. Companion calls switches at seven minutes; never interrupt a re-read. 2. The turn: partner reads; 'the doubt I am holding is ___'; gentle exaggerate; sit 10–20s; re-read; 'what I notice this time is ___'. 3. Interventions: apologetics — 'we're not arguing the doubt'; no doubt found — honest, run the partner's cycle; exaggeration won't come — don't push; distress — stop the exaggeration, re-read, sit with them.</w:t>
+        <w:t>1. Twenty-six minutes: one full cycle each direction, about 12 min per turn, parent's turn first. The silent place follows, so hold the clock. Companion calls switches at seven minutes; never interrupt a re-read. 2. The turn: partner reads; 'the doubt I am holding is ___'; gentle exaggerate; sit 10–20s; re-read; 'what I notice this time is ___'. 3. Interventions: apologetics — 'we're not arguing the doubt'; no doubt found — honest, run the partner's cycle; exaggeration won't come — don't push; distress — stop the exaggeration, re-read, sit with them.</w:t>
       </w:r>
     </w:p>
     <w:p>
@@ -1165,6 +1165,154 @@
       <w:pPr>
         <w:keepNext/>
         <w:pBdr>
+          <w:left w:val="double" w:sz="12" w:space="8" w:color="B45309"/>
+        </w:pBdr>
+        <w:shd w:val="clear" w:color="auto" w:fill="FCE9D6"/>
+        <w:spacing w:before="160" w:after="40"/>
+      </w:pPr>
+      <w:r>
+        <w:rPr>
+          <w:rFonts w:ascii="Cambria" w:hAnsi="Cambria"/>
+          <w:b/>
+          <w:color w:val="B45309"/>
+          <w:sz w:val="30"/>
+        </w:rPr>
+        <w:t>168</w:t>
+      </w:r>
+      <w:r>
+        <w:rPr>
+          <w:rFonts w:ascii="Cambria" w:hAnsi="Cambria"/>
+          <w:b/>
+          <w:color w:val="2C5F2D"/>
+          <w:sz w:val="24"/>
+        </w:rPr>
+        <w:t xml:space="preserve">   The Silent Place — Bringing In the Time You Heard</w:t>
+      </w:r>
+      <w:r>
+        <w:rPr>
+          <w:b/>
+          <w:color w:val="B45309"/>
+          <w:sz w:val="17"/>
+        </w:rPr>
+        <w:t xml:space="preserve">    CONTENT PRESENTER</w:t>
+      </w:r>
+      <w:r>
+        <w:rPr>
+          <w:b w:val="0"/>
+          <w:color w:val="7F7F7F"/>
+          <w:sz w:val="16"/>
+        </w:rPr>
+        <w:t xml:space="preserve">   · slide 11 of 18</w:t>
+      </w:r>
+    </w:p>
+    <w:p>
+      <w:pPr>
+        <w:keepNext/>
+        <w:pBdr>
+          <w:left w:val="double" w:sz="12" w:space="8" w:color="B45309"/>
+        </w:pBdr>
+        <w:spacing w:before="0" w:after="60"/>
+      </w:pPr>
+      <w:r>
+        <w:rPr>
+          <w:b/>
+          <w:color w:val="6B8E3F"/>
+          <w:sz w:val="18"/>
+        </w:rPr>
+        <w:t xml:space="preserve">S11 · 7:56–8:09 · </w:t>
+      </w:r>
+      <w:r>
+        <w:rPr>
+          <w:b/>
+          <w:color w:val="B45309"/>
+          <w:sz w:val="18"/>
+        </w:rPr>
+        <w:t>LEAD: CONTENT PRESENTER</w:t>
+      </w:r>
+      <w:r>
+        <w:rPr>
+          <w:b/>
+          <w:color w:val="6B8E3F"/>
+          <w:sz w:val="18"/>
+        </w:rPr>
+      </w:r>
+    </w:p>
+    <w:p>
+      <w:pPr>
+        <w:pBdr>
+          <w:left w:val="double" w:sz="12" w:space="8" w:color="B45309"/>
+        </w:pBdr>
+        <w:spacing w:before="0" w:after="60"/>
+      </w:pPr>
+      <w:r>
+        <w:rPr>
+          <w:b/>
+          <w:color w:val="595959"/>
+        </w:rPr>
+        <w:t xml:space="preserve">BEATS: </w:t>
+      </w:r>
+      <w:r>
+        <w:t>1. The reader reads the Silent Place Reading Card. Settle, 1 minute. 2. Remember, about 2 minutes: a time or place where God seemed silent — a dry spell, a prayer that met nothing. Get clear on it. 3. Bring in the anchor: the time you did hear, remembered at the Garden evening — what it looked, sounded and felt like — into the silent place. 4. Invite Jesus into the silent place; give him permission to do or say anything he wishes; then about three minutes of silence. See what he does. Return. 5. Write, 3 minutes: what did he do? Is something blocking, or in the way? What might be the downside of a deeper connection — what would change? 6. Share, 2 minutes, optional: one circle, by invitation; 'Thank you' is the whole response.</w:t>
+      </w:r>
+    </w:p>
+    <w:p>
+      <w:pPr>
+        <w:pBdr>
+          <w:left w:val="double" w:sz="12" w:space="8" w:color="B45309"/>
+        </w:pBdr>
+        <w:spacing w:before="0" w:after="60"/>
+      </w:pPr>
+      <w:r>
+        <w:rPr>
+          <w:b/>
+          <w:color w:val="595959"/>
+        </w:rPr>
+        <w:t xml:space="preserve">CUES: </w:t>
+      </w:r>
+      <w:r>
+        <w:t>Sharing is optional — say so twice. No anchor from the Garden evening? Offer a time creation stopped you, or simply John 10:27.</w:t>
+      </w:r>
+    </w:p>
+    <w:p>
+      <w:pPr>
+        <w:pBdr>
+          <w:left w:val="double" w:sz="12" w:space="8" w:color="B45309"/>
+        </w:pBdr>
+        <w:spacing w:before="0" w:after="60"/>
+      </w:pPr>
+      <w:r>
+        <w:rPr>
+          <w:b/>
+          <w:color w:val="595959"/>
+        </w:rPr>
+        <w:t xml:space="preserve">GUARD: </w:t>
+      </w:r>
+      <w:r>
+        <w:t>Silence is not a verdict on anyone. If a silent place opens something heavy, the Settle Protocol stands — for the person, not the circle; follow up within 48 hours.</w:t>
+      </w:r>
+    </w:p>
+    <w:p>
+      <w:pPr>
+        <w:pBdr>
+          <w:left w:val="double" w:sz="12" w:space="8" w:color="B45309"/>
+        </w:pBdr>
+        <w:spacing w:before="0" w:after="60"/>
+      </w:pPr>
+      <w:r>
+        <w:rPr>
+          <w:b/>
+          <w:color w:val="595959"/>
+        </w:rPr>
+        <w:t xml:space="preserve">FROM: </w:t>
+      </w:r>
+      <w:r>
+        <w:t>the Four Connects deck (FotH, September 2025), 'Hearing God — The How' (remember a place where the Lord was not speaking; change with the anchor; invite in Jesus, give him permission; share optional) and 'Connect with God' (is something blocking; the downside to a deeper connection).</w:t>
+      </w:r>
+    </w:p>
+    <w:p>
+      <w:pPr>
+        <w:keepNext/>
+        <w:pBdr>
           <w:left w:val="single" w:sz="24" w:space="8" w:color="1F4E79"/>
         </w:pBdr>
         <w:shd w:val="clear" w:color="auto" w:fill="DEEAF6"/>
@@ -1177,7 +1325,7 @@
           <w:color w:val="1F4E79"/>
           <w:sz w:val="30"/>
         </w:rPr>
-        <w:t>168</w:t>
+        <w:t>169</w:t>
       </w:r>
       <w:r>
         <w:rPr>
@@ -1202,7 +1350,7 @@
           <w:color w:val="7F7F7F"/>
           <w:sz w:val="16"/>
         </w:rPr>
-        <w:t xml:space="preserve">   · slide 11 of 17</w:t>
+        <w:t xml:space="preserve">   · slide 12 of 18</w:t>
       </w:r>
     </w:p>
     <w:p>
@@ -1219,7 +1367,7 @@
           <w:color w:val="6B8E3F"/>
           <w:sz w:val="18"/>
         </w:rPr>
-        <w:t xml:space="preserve">S11 · 8:14–8:20 · </w:t>
+        <w:t xml:space="preserve">S11 · 8:09–8:15 · </w:t>
       </w:r>
       <w:r>
         <w:rPr>
@@ -1252,7 +1400,7 @@
         <w:t xml:space="preserve">BEATS: </w:t>
       </w:r>
       <w:r>
-        <w:t>1. What happened in your pair stays in your pair — not back to the pair, not around the dinner table, unless the one who named it brings it up first. 2. One word about the practice, not the doubt: 'surprising', 'heavy', 'honest', 'lighter'. Receive with a nod; no commentary. 3. Two closers: this practice takes five minutes alone, for the rest of your life; and the naming is ours — the resolution is the Spirit's work.</w:t>
+        <w:t>1. What happened in your pair stays in your pair — not back to the pair, not around the dinner table, unless the one who named it brings it up first. 2. One word about the practices, not the doubt or the silent place: 'surprising', 'heavy', 'honest', 'lighter'. Receive with a nod; no commentary. 3. Two closers: this practice takes five minutes alone, for the rest of your life; and the naming is ours — the resolution is the Spirit's work.</w:t>
       </w:r>
     </w:p>
     <w:p>
@@ -1289,7 +1437,7 @@
           <w:color w:val="B45309"/>
           <w:sz w:val="30"/>
         </w:rPr>
-        <w:t>169</w:t>
+        <w:t>170</w:t>
       </w:r>
       <w:r>
         <w:rPr>
@@ -1314,7 +1462,7 @@
           <w:color w:val="7F7F7F"/>
           <w:sz w:val="16"/>
         </w:rPr>
-        <w:t xml:space="preserve">   · slide 12 of 17</w:t>
+        <w:t xml:space="preserve">   · slide 13 of 18</w:t>
       </w:r>
     </w:p>
     <w:p>
@@ -1331,7 +1479,7 @@
           <w:color w:val="6B8E3F"/>
           <w:sz w:val="18"/>
         </w:rPr>
-        <w:t xml:space="preserve">S11 · 8:20–8:24 · </w:t>
+        <w:t xml:space="preserve">S11 · 8:15–8:21 · </w:t>
       </w:r>
       <w:r>
         <w:rPr>
@@ -1364,7 +1512,25 @@
         <w:t xml:space="preserve">BEATS: </w:t>
       </w:r>
       <w:r>
-        <w:t>1. Personal Doubts Inventory (H11.2): twenty minutes once this week — list 5–10 scriptures you say you believe, rate your honest trust in each, and write one specific sentence on the 2–3 lowest. No shame, just data; nobody ever sees it. 2. Hand out the Quarterly Pulse (H11.4): three questions, five minutes at home, honest — back in the bin at The Return's door in January. 3. 'Body in the room, mind on the mortgage' is exactly the kind of answer the page is for.</w:t>
+        <w:t>1. Week one, the Personal Doubts Inventory (H11.2): twenty minutes once — list 5–10 scriptures you say you believe, rate your honest trust in each, and write one specific sentence on the two or three lowest. No shame, just data; nobody ever sees it. 2. Week two, two journal questions from the Four Connects deck: 'Is there something I heard and did not obey?' — obedience opens you to hear more — and 'What is at risk for me to hear?' 3. Anything you're not sure was God: the How Did You Know? card, tested in company. 4. Hand out the Quarterly Pulse (H11.4): three questions, five minutes at home, honest — bring it back next evening.</w:t>
+      </w:r>
+    </w:p>
+    <w:p>
+      <w:pPr>
+        <w:pBdr>
+          <w:left w:val="double" w:sz="12" w:space="8" w:color="B45309"/>
+        </w:pBdr>
+        <w:spacing w:before="0" w:after="60"/>
+      </w:pPr>
+      <w:r>
+        <w:rPr>
+          <w:b/>
+          <w:color w:val="595959"/>
+        </w:rPr>
+        <w:t xml:space="preserve">FROM: </w:t>
+      </w:r>
+      <w:r>
+        <w:t>the Four Connects deck (FotH, September 2025), 'Hearing God — What If?'.</w:t>
       </w:r>
     </w:p>
     <w:p>
@@ -1383,7 +1549,7 @@
           <w:color w:val="B45309"/>
           <w:sz w:val="30"/>
         </w:rPr>
-        <w:t>170</w:t>
+        <w:t>171</w:t>
       </w:r>
       <w:r>
         <w:rPr>
@@ -1408,7 +1574,7 @@
           <w:color w:val="7F7F7F"/>
           <w:sz w:val="16"/>
         </w:rPr>
-        <w:t xml:space="preserve">   · slide 13 of 17</w:t>
+        <w:t xml:space="preserve">   · slide 14 of 18</w:t>
       </w:r>
     </w:p>
     <w:p>
@@ -1525,7 +1691,7 @@
           <w:color w:val="B45309"/>
           <w:sz w:val="30"/>
         </w:rPr>
-        <w:t>171</w:t>
+        <w:t>172</w:t>
       </w:r>
       <w:r>
         <w:rPr>
@@ -1550,7 +1716,7 @@
           <w:color w:val="7F7F7F"/>
           <w:sz w:val="16"/>
         </w:rPr>
-        <w:t xml:space="preserve">   · slide 14 of 17</w:t>
+        <w:t xml:space="preserve">   · slide 15 of 18</w:t>
       </w:r>
     </w:p>
     <w:p>
@@ -1656,7 +1822,7 @@
           <w:color w:val="6B3FA0"/>
           <w:sz w:val="30"/>
         </w:rPr>
-        <w:t>172</w:t>
+        <w:t>173</w:t>
       </w:r>
       <w:r>
         <w:rPr>
@@ -1681,7 +1847,7 @@
           <w:color w:val="7F7F7F"/>
           <w:sz w:val="16"/>
         </w:rPr>
-        <w:t xml:space="preserve">   · slide 15 of 17</w:t>
+        <w:t xml:space="preserve">   · slide 16 of 18</w:t>
       </w:r>
     </w:p>
     <w:p>
@@ -1698,7 +1864,7 @@
           <w:color w:val="6B8E3F"/>
           <w:sz w:val="18"/>
         </w:rPr>
-        <w:t xml:space="preserve">S11 · 8:24–8:28 · </w:t>
+        <w:t xml:space="preserve">S11 · 8:21–8:25 · </w:t>
       </w:r>
       <w:r>
         <w:rPr>
@@ -1750,7 +1916,7 @@
           <w:color w:val="1F4E79"/>
           <w:sz w:val="30"/>
         </w:rPr>
-        <w:t>173</w:t>
+        <w:t>174</w:t>
       </w:r>
       <w:r>
         <w:rPr>
@@ -1775,7 +1941,7 @@
           <w:color w:val="7F7F7F"/>
           <w:sz w:val="16"/>
         </w:rPr>
-        <w:t xml:space="preserve">   · slide 16 of 17</w:t>
+        <w:t xml:space="preserve">   · slide 17 of 18</w:t>
       </w:r>
     </w:p>
     <w:p>
@@ -1792,7 +1958,7 @@
           <w:color w:val="6B8E3F"/>
           <w:sz w:val="18"/>
         </w:rPr>
-        <w:t xml:space="preserve">S11 · 8:28–8:30 · </w:t>
+        <w:t xml:space="preserve">S11 · 8:25–8:30 · </w:t>
       </w:r>
       <w:r>
         <w:rPr>
@@ -1825,7 +1991,7 @@
         <w:t xml:space="preserve">BEATS: </w:t>
       </w:r>
       <w:r>
-        <w:t>1. What was named in your pair is yours — some doubts quietly resolve, some deepen before they release; both are normal. If anything is heavier than today could hold, reach out. 2. Announce the road: quarter break now; The Return in January; then Week 13 turns outward to Mission, on toward the Rhythm week and the two commissionings. 3. Aaronic blessing. 'Keep one practice alive over the break — just one. See you in January, at The Return. Merry Christmas to every house in this room.'</w:t>
+        <w:t>1. What was named in your pair is yours — some doubts quietly resolve, some deepen before they release; both are normal. If anything is heavier than tonight could hold, reach out. 2. Announce the next evening and its date, as the team has set it; Session 12 turns toward Mission. 3. Aaronic blessing.</w:t>
       </w:r>
     </w:p>
     <w:p>
@@ -1862,7 +2028,7 @@
           <w:color w:val="8C8C8C"/>
           <w:sz w:val="30"/>
         </w:rPr>
-        <w:t>174</w:t>
+        <w:t>175</w:t>
       </w:r>
       <w:r>
         <w:rPr>
@@ -1887,7 +2053,7 @@
           <w:color w:val="7F7F7F"/>
           <w:sz w:val="16"/>
         </w:rPr>
-        <w:t xml:space="preserve">   · slide 17 of 17</w:t>
+        <w:t xml:space="preserve">   · slide 18 of 18</w:t>
       </w:r>
     </w:p>
     <w:p>
@@ -1915,7 +2081,7 @@
         <w:spacing w:before="0" w:after="60"/>
       </w:pPr>
       <w:r>
-        <w:t>On screen as families arrive — first evenings back after the Christmas break. Today is The Return: the open runs slow on purpose. Greet warmly at the door; nobody owes an explanation for the break.</w:t>
+        <w:t>On screen as families arrive at the next evening. Greet warmly at the door.</w:t>
       </w:r>
     </w:p>
     <w:p>

</xml_diff>

<commit_message>
v2.49: Evening 8, the return and the Christmas send-off (John's word, 2026-10-28) - the return round opens the evening 7:06-7:18 (which practices chosen and why, what held, did you come back on your own, which you would keep, then "one thing I'm not sure was God"); pairs 7:31-7:53 give back the minutes; quiet tally at the debrief; take-home to The Return on one page (inventory, check-in, two journal questions, then the break chosen from The Practices So Far, two preparation sentences); Practices So Far card with Any Doubts? added; deck (no slides added) return slide, road, homework, sheets, close, "Quarter" becomes "movement"; leader notes rebuilt; run sheet new clock, Block column widened, three pages; Evening 8 page brought in line with the 13 October design (silent place); synced to OneDrive
Co-Authored-By: Claude Opus 5.5 <noreply@anthropic.com>
</commit_message>
<xml_diff>
--- a/_implementation-notes/evening-series/FotH Evening Session 11 Leader Notes DRAFT v1.docx
+++ b/_implementation-notes/evening-series/FotH Evening Session 11 Leader Notes DRAFT v1.docx
@@ -484,7 +484,18 @@
         <w:t xml:space="preserve">BEATS: </w:t>
       </w:r>
       <w:r>
-        <w:t>1. Evening 8 — the last evening of Connect with God. Tonight picks up the Garden evening's thread: what I'm not sure was God. 2. Today: Any Doubts? — bringing the small quiet doubts we never say aloud, honestly, to God, in front of one other person. 3. With the Garden, one of the two highest-confidence practices in this whole body of work — treat it with care. 4. Frame it early and repeat it: doubt is not disbelief; this is the gap between what we say and what we actually trust. 5. The shape (John's word, 13 October): the four steps in pairs, then the silent place from the Four Connects deck — remember where God seemed silent, bring in the time you heard, invite Jesus in.</w:t>
+        <w:t>1. Evening 8 — the last evening of Connect with God. Tonight is the first evening after four weeks apart (no evening over Thanksgiving): it opens with the return round, then picks up the Garden evening's thread: what I'm not sure was God. 2. Today: Any Doubts? — bringing the small quiet doubts we never say aloud, honestly, to God, in front of one other person. 3. With the Garden, one of the two highest-confidence practices in this whole body of work — treat it with care. 4. Frame it early and repeat it: doubt is not disbelief; this is the gap between what we say and what we actually trust. 5. The shape (John's word, 13 October): the four steps in pairs, then the silent place from the Four Connects deck — remember where God seemed silent, bring in the time you heard, invite Jesus in.</w:t>
+      </w:r>
+    </w:p>
+    <w:p>
+      <w:pPr>
+        <w:pBdr>
+          <w:left w:val="single" w:sz="24" w:space="8" w:color="1F4E79"/>
+        </w:pBdr>
+        <w:spacing w:before="0" w:after="60"/>
+      </w:pPr>
+      <w:r>
+        <w:t>THE BREAKS (John's word, 28 October): the return round opens tonight; the Christmas send-off closes it. The Return opens January.</w:t>
       </w:r>
     </w:p>
     <w:p>
@@ -624,7 +635,7 @@
           <w:color w:val="2C5F2D"/>
           <w:sz w:val="24"/>
         </w:rPr>
-        <w:t xml:space="preserve">   Check-In — the Garden, and What I’m Not Sure Was God</w:t>
+        <w:t xml:space="preserve">   The Return — Four Weeks, and What I’m Not Sure Was God</w:t>
       </w:r>
       <w:r>
         <w:rPr>
@@ -657,7 +668,7 @@
           <w:color w:val="6B8E3F"/>
           <w:sz w:val="18"/>
         </w:rPr>
-        <w:t xml:space="preserve">E8 · 7:06–7:14 · </w:t>
+        <w:t xml:space="preserve">E8 · 7:06–7:18 · </w:t>
       </w:r>
       <w:r>
         <w:rPr>
@@ -690,7 +701,43 @@
         <w:t xml:space="preserve">BEATS: </w:t>
       </w:r>
       <w:r>
-        <w:t>1. One sentence on the garden returns — how it went, what surfaced, whether anyone tested what they noticed with the How Did You Know? card. 2. The preparation sentence from the Garden take-home: 'One thing I'm not sure was God, or one question I'd bring tonight.' Say it aloud, or keep it for your pair — both are fine. 3. Two or three voluntary contributions; receive without commentary. Move on with: 'Good. The garden is still there. Tonight we bring the questions.'</w:t>
+        <w:t>1. Rebuild the room slowly: it has been four weeks. 2. Around the circle, one at a time, the leader first, then a parent: which practices did you choose for weeks three and four, and why; what held; when it slipped, did you come back to it on your own, because you wanted to; which one would you keep. A sentence on the garden weeks if they wish. 3. The preparation sentence from the Garden take-home, 'One thing I'm not sure was God': say it aloud, or keep it for your pair. 4. Receive each with 'We hear that'; no comment. Move on with: 'Good. The garden is still there. Tonight we bring the questions.'</w:t>
+      </w:r>
+    </w:p>
+    <w:p>
+      <w:pPr>
+        <w:pBdr>
+          <w:left w:val="single" w:sz="24" w:space="8" w:color="1F4E79"/>
+        </w:pBdr>
+        <w:spacing w:before="0" w:after="60"/>
+      </w:pPr>
+      <w:r>
+        <w:rPr>
+          <w:b/>
+          <w:color w:val="595959"/>
+        </w:rPr>
+        <w:t xml:space="preserve">GUARD: </w:t>
+      </w:r>
+      <w:r>
+        <w:t>Cut the shame spiral off early, from the front: slips are data, and nobody owes an explanation for the gap. Receive 'No, not yet' as warmly as 'Yes.' If the gap was hard at home, that is a conversation with an adult tonight or this week, not a circle one.</w:t>
+      </w:r>
+    </w:p>
+    <w:p>
+      <w:pPr>
+        <w:pBdr>
+          <w:left w:val="single" w:sz="24" w:space="8" w:color="1F4E79"/>
+        </w:pBdr>
+        <w:spacing w:before="0" w:after="60"/>
+      </w:pPr>
+      <w:r>
+        <w:rPr>
+          <w:b/>
+          <w:color w:val="595959"/>
+        </w:rPr>
+        <w:t xml:space="preserve">TALLY: </w:t>
+      </w:r>
+      <w:r>
+        <w:t>at the debrief, a quiet count for each practice: how many chose it, and how many would keep it. No names. This is the read on which practices people really want to do (John's word, 28 October); The Return runs it again for the Christmas choices.</w:t>
       </w:r>
     </w:p>
     <w:p>
@@ -708,7 +755,7 @@
         <w:t xml:space="preserve">CUES: </w:t>
       </w:r>
       <w:r>
-        <w:t>Arranged parent opens — never cold-call a teen; pass-anytime holds.</w:t>
+        <w:t>Arranged parent opens after the leader; never cold-call a teen; pass-anytime holds.</w:t>
       </w:r>
     </w:p>
     <w:p>
@@ -769,7 +816,7 @@
           <w:color w:val="6B8E3F"/>
           <w:sz w:val="18"/>
         </w:rPr>
-        <w:t xml:space="preserve">E8 · 7:14–7:20 · </w:t>
+        <w:t xml:space="preserve">E8 · 7:18–7:23 · </w:t>
       </w:r>
       <w:r>
         <w:rPr>
@@ -863,7 +910,7 @@
           <w:color w:val="6B8E3F"/>
           <w:sz w:val="18"/>
         </w:rPr>
-        <w:t xml:space="preserve">E8 · 7:20–7:28 · </w:t>
+        <w:t xml:space="preserve">E8 · 7:23–7:30 · </w:t>
       </w:r>
       <w:r>
         <w:rPr>
@@ -993,7 +1040,7 @@
           <w:color w:val="6B8E3F"/>
           <w:sz w:val="18"/>
         </w:rPr>
-        <w:t xml:space="preserve">E8 · 7:28–7:30 · </w:t>
+        <w:t xml:space="preserve">E8 · 7:30–7:31 · </w:t>
       </w:r>
       <w:r>
         <w:rPr>
@@ -1106,7 +1153,7 @@
           <w:color w:val="6B8E3F"/>
           <w:sz w:val="18"/>
         </w:rPr>
-        <w:t xml:space="preserve">E8 · 7:30–7:56 · </w:t>
+        <w:t xml:space="preserve">E8 · 7:31–7:53 · </w:t>
       </w:r>
       <w:r>
         <w:rPr>
@@ -1140,7 +1187,7 @@
         <w:t xml:space="preserve">BEATS: </w:t>
       </w:r>
       <w:r>
-        <w:t>1. Twenty-six minutes: one full cycle each direction, about 12 min per turn, parent's turn first. The silent place follows, so hold the clock. Companion calls switches at seven minutes; never interrupt a re-read. 2. The turn: partner reads; 'the doubt I am holding is ___'; gentle exaggerate; sit 10–20s; re-read; 'what I notice this time is ___'. 3. Interventions: apologetics — 'we're not arguing the doubt'; no doubt found — honest, run the partner's cycle; exaggeration won't come — don't push; distress — stop the exaggeration, re-read, sit with them.</w:t>
+        <w:t>1. Twenty-two minutes: one full cycle each direction, about 11 min per turn, parent's turn first. The silent place follows, so hold the clock. Companion calls switches at seven minutes; never interrupt a re-read. 2. The turn: partner reads; 'the doubt I am holding is ___'; gentle exaggerate; sit 10–20s; re-read; 'what I notice this time is ___'. 3. Interventions: apologetics — 'we're not arguing the doubt'; no doubt found — honest, run the partner's cycle; exaggeration won't come — don't push; distress — stop the exaggeration, re-read, sit with them.</w:t>
       </w:r>
     </w:p>
     <w:p>
@@ -1219,7 +1266,7 @@
           <w:color w:val="6B8E3F"/>
           <w:sz w:val="18"/>
         </w:rPr>
-        <w:t xml:space="preserve">E8 · 7:56–8:09 · </w:t>
+        <w:t xml:space="preserve">E8 · 7:53–8:06 · </w:t>
       </w:r>
       <w:r>
         <w:rPr>
@@ -1367,7 +1414,7 @@
           <w:color w:val="6B8E3F"/>
           <w:sz w:val="18"/>
         </w:rPr>
-        <w:t xml:space="preserve">E8 · 8:09–8:15 · </w:t>
+        <w:t xml:space="preserve">E8 · 8:06–8:12 · </w:t>
       </w:r>
       <w:r>
         <w:rPr>
@@ -1446,7 +1493,7 @@
           <w:color w:val="2C5F2D"/>
           <w:sz w:val="24"/>
         </w:rPr>
-        <w:t xml:space="preserve">   Homework — Two Weeks, Four Parts — the Doubts Inventory</w:t>
+        <w:t xml:space="preserve">   Homework — Two Weeks, Then the Christmas Break</w:t>
       </w:r>
       <w:r>
         <w:rPr>
@@ -1479,7 +1526,7 @@
           <w:color w:val="6B8E3F"/>
           <w:sz w:val="18"/>
         </w:rPr>
-        <w:t xml:space="preserve">E8 · 8:15–8:21 · </w:t>
+        <w:t xml:space="preserve">E8 · 8:12–8:21 · </w:t>
       </w:r>
       <w:r>
         <w:rPr>
@@ -1512,7 +1559,25 @@
         <w:t xml:space="preserve">BEATS: </w:t>
       </w:r>
       <w:r>
-        <w:t>1. Week one, the Personal Doubts Inventory (H11.2): twenty minutes once — list 5–10 scriptures you say you believe, rate your honest trust in each, and write one specific sentence on the two or three lowest. No shame, just data; nobody ever sees it. 2. Week two, two journal questions from the Four Connects deck: 'Is there something I heard and did not obey?' — obedience opens you to hear more — and 'What is at risk for me to hear?' 3. Anything you're not sure was God: the How Did You Know? card, tested in company. 4. Hand out the Quarterly Pulse (H11.4): three questions, five minutes at home, honest — bring it back next evening.</w:t>
+        <w:t>1. Week one, the Personal Doubts Inventory (H11.2): twenty minutes once; list 5–10 scriptures you say you believe, rate your honest trust in each, write one specific sentence on the two or three lowest. No shame, just data; nobody ever sees it. 2. The check-in at the end of week one. 3. Week two, two journal questions from the Four Connects deck: 'Is there something I heard and did not obey?' and 'What is at risk for me to hear?' 4. The Christmas break: after the two weeks, each week one practice from The Practices So Far card, the one you would really like to do, written down with why. Read the list once, aloud; never steer. 5. The returning rule; name who to reach over the break. 6. Hand out the Quarterly Pulse (H11.4): three questions, five minutes at home; bring it to The Return.</w:t>
+      </w:r>
+    </w:p>
+    <w:p>
+      <w:pPr>
+        <w:pBdr>
+          <w:left w:val="double" w:sz="12" w:space="8" w:color="B45309"/>
+        </w:pBdr>
+        <w:spacing w:before="0" w:after="60"/>
+      </w:pPr>
+      <w:r>
+        <w:rPr>
+          <w:b/>
+          <w:color w:val="595959"/>
+        </w:rPr>
+        <w:t xml:space="preserve">GUARD: </w:t>
+      </w:r>
+      <w:r>
+        <w:t>Name the break plainly: how long it is, and that The Return opens by asking which practices were chosen and how it went. The choices are made at home, freely.</w:t>
       </w:r>
     </w:p>
     <w:p>
@@ -1643,7 +1708,7 @@
         <w:spacing w:before="0" w:after="60"/>
       </w:pPr>
       <w:r>
-        <w:t>2. The standing rhythm first: the morning question, the evening journal line — one box per day on the week-grids.</w:t>
+        <w:t>2. The standing rhythm first: the morning question, the evening journal line — one box per day, on one grid for the weeks to The Return.</w:t>
       </w:r>
     </w:p>
     <w:p>
@@ -1672,7 +1737,7 @@
         <w:t xml:space="preserve">CUES: </w:t>
       </w:r>
       <w:r>
-        <w:t>The four parts are the next slide.</w:t>
+        <w:t>The five parts are the next slide.</w:t>
       </w:r>
     </w:p>
     <w:p>
@@ -1700,7 +1765,7 @@
           <w:color w:val="2C5F2D"/>
           <w:sz w:val="24"/>
         </w:rPr>
-        <w:t xml:space="preserve">   The Take-Home Sheet — the Four Parts</w:t>
+        <w:t xml:space="preserve">   The Take-Home Sheet — the Five Parts</w:t>
       </w:r>
       <w:r>
         <w:rPr>
@@ -1774,7 +1839,7 @@
         <w:spacing w:before="0" w:after="60"/>
       </w:pPr>
       <w:r>
-        <w:t>1. The four parts, in order: the homework practice, week one; the end-of-week-one check-in; the homework practice, week two; one sentence of preparation.</w:t>
+        <w:t>1. The five parts, in order: week one, the doubts inventory; the end-of-week-one check-in; week two, the two journal questions; the rest of the break, your choice from The Practices So Far; two sentences of preparation for The Return.</w:t>
       </w:r>
     </w:p>
     <w:p>
@@ -1785,7 +1850,18 @@
         <w:spacing w:before="0" w:after="60"/>
       </w:pPr>
       <w:r>
-        <w:t>2. Check-in partners are named aloud before leaving this slide — the sheet has the line to write the name.</w:t>
+        <w:t>2. Check-in partners are named aloud before leaving this slide; the sheet has the line to write the name.</w:t>
+      </w:r>
+    </w:p>
+    <w:p>
+      <w:pPr>
+        <w:pBdr>
+          <w:left w:val="double" w:sz="12" w:space="8" w:color="B45309"/>
+        </w:pBdr>
+        <w:spacing w:before="0" w:after="60"/>
+      </w:pPr>
+      <w:r>
+        <w:t>3. The Practices So Far card goes with the sheet, with Any Doubts? now on it.</w:t>
       </w:r>
     </w:p>
     <w:p>
@@ -1991,7 +2067,7 @@
         <w:t xml:space="preserve">BEATS: </w:t>
       </w:r>
       <w:r>
-        <w:t>1. What was named in your pair is yours — some doubts quietly resolve, some deepen before they release; both are normal. If anything is heavier than tonight could hold, reach out. 2. Announce the next evening and its date, as the team has set it; Evening 9 turns toward Mission. 3. Aaronic blessing.</w:t>
+        <w:t>1. What was named in your pair is yours — some doubts quietly resolve, some deepen before they release; both are normal. If anything is heavier than tonight could hold, reach out. 2. Name the Christmas break plainly and who to reach over it; Evening 9, The Return, opens January and asks which practices you chose. Merry Christmas to every house. 3. Aaronic blessing.</w:t>
       </w:r>
     </w:p>
     <w:p>
@@ -2037,7 +2113,7 @@
           <w:color w:val="2C5F2D"/>
           <w:sz w:val="24"/>
         </w:rPr>
-        <w:t xml:space="preserve">   Quarter 3</w:t>
+        <w:t xml:space="preserve">   The Third Movement</w:t>
       </w:r>
       <w:r>
         <w:rPr>
@@ -2070,7 +2146,7 @@
           <w:color w:val="6B8E3F"/>
           <w:sz w:val="18"/>
         </w:rPr>
-        <w:t>QUARTER 3 · pre-session · DIVIDER</w:t>
+        <w:t>MOVEMENT 3 · pre-session · DIVIDER</w:t>
       </w:r>
     </w:p>
     <w:p>

</xml_diff>